<commit_message>
Don't allow to break the rows
</commit_message>
<xml_diff>
--- a/templates/electro_safety.docx
+++ b/templates/electro_safety.docx
@@ -1467,7 +1467,6 @@
               <w:left w:val="nil"/>
               <w:right w:val="nil"/>
             </w:tcBorders>
-            <w:vAlign w:val="bottom"/>
           </w:tcPr>
           <w:p>
             <w:pPr>
@@ -1500,7 +1499,6 @@
               <w:left w:val="nil"/>
               <w:right w:val="nil"/>
             </w:tcBorders>
-            <w:vAlign w:val="bottom"/>
           </w:tcPr>
           <w:p>
             <w:pPr>
@@ -1556,7 +1554,6 @@
             <w:tcBorders>
               <w:left w:val="nil"/>
             </w:tcBorders>
-            <w:vAlign w:val="center"/>
           </w:tcPr>
           <w:p>
             <w:pPr>
@@ -1589,7 +1586,6 @@
         <w:tc>
           <w:tcPr>
             <w:tcW w:w="1836" w:type="dxa"/>
-            <w:vAlign w:val="center"/>
           </w:tcPr>
           <w:p>
             <w:pPr>
@@ -1610,7 +1606,6 @@
         <w:tc>
           <w:tcPr>
             <w:tcW w:w="1085" w:type="dxa"/>
-            <w:vAlign w:val="center"/>
           </w:tcPr>
           <w:p>
             <w:pPr>
@@ -1634,7 +1629,6 @@
             <w:tcBorders>
               <w:right w:val="nil"/>
             </w:tcBorders>
-            <w:vAlign w:val="center"/>
           </w:tcPr>
           <w:p>
             <w:pPr>
@@ -1682,7 +1676,6 @@
             <w:tcBorders>
               <w:left w:val="nil"/>
             </w:tcBorders>
-            <w:vAlign w:val="center"/>
           </w:tcPr>
           <w:p>
             <w:pPr>
@@ -1702,7 +1695,6 @@
         <w:tc>
           <w:tcPr>
             <w:tcW w:w="949" w:type="dxa"/>
-            <w:vAlign w:val="center"/>
           </w:tcPr>
           <w:p>
             <w:pPr>
@@ -1722,7 +1714,6 @@
         <w:tc>
           <w:tcPr>
             <w:tcW w:w="1136" w:type="dxa"/>
-            <w:vAlign w:val="center"/>
           </w:tcPr>
           <w:p>
             <w:pPr>
@@ -1742,7 +1733,6 @@
         <w:tc>
           <w:tcPr>
             <w:tcW w:w="1327" w:type="dxa"/>
-            <w:vAlign w:val="center"/>
           </w:tcPr>
           <w:p>
             <w:pPr>
@@ -1765,7 +1755,6 @@
             <w:tcBorders>
               <w:right w:val="nil"/>
             </w:tcBorders>
-            <w:vAlign w:val="center"/>
           </w:tcPr>
           <w:p>
             <w:pPr>
@@ -2813,6 +2802,7 @@
       </w:tblGrid>
       <w:tr>
         <w:trPr>
+          <w:cantSplit/>
           <w:trHeight w:hRule="exact" w:val="510"/>
           <w:jc w:val="center"/>
         </w:trPr>

</xml_diff>